<commit_message>
docs: fix TDD — restore E2E para, correct Joshua backlog item (still open)
</commit_message>
<xml_diff>
--- a/documentation/ARIA_Technical_Design_Document.docx
+++ b/documentation/ARIA_Technical_Design_Document.docx
@@ -17766,21 +17766,19 @@
         <w:rPr>
           <w:color w:val="1A1A2E"/>
         </w:rPr>
-        <w:t>E2E test suite runs against production. Coverage: 95% pass rate as of Session 15 (2026-03-27). 1 known gap: Joshua portfolio linking (</w:t>
+        <w:t>E2E test suite runs against production. Coverage: 95% pass rate as of Session 15 (2026-03-27). 1 known gap: Joshua portfolio linking (personal_user_id not linked — data issue, not code bug). All new tests follow [TEST] prefix + [E2E] notes convention for cleanup automation.</w:t>
       </w:r>
       <w:proofErr w:type="spellStart"/>
       <w:r>
         <w:rPr>
           <w:color w:val="1A1A2E"/>
         </w:rPr>
-        <w:t>personal_user_id</w:t>
       </w:r>
       <w:proofErr w:type="spellEnd"/>
       <w:r>
         <w:rPr>
           <w:color w:val="1A1A2E"/>
         </w:rPr>
-        <w:t xml:space="preserve"> not linked — data issue, not code bug). All new tests follow [TEST] prefix + [E2E] notes convention for cleanup automation.</w:t>
       </w:r>
     </w:p>
     <w:tbl>
@@ -19836,21 +19834,19 @@
         <w:rPr>
           <w:color w:val="1A1A2E"/>
         </w:rPr>
-        <w:t xml:space="preserve">Joshua portfolio linking: </w:t>
+        <w:t>Joshua portfolio linking: personal_user_id not linked on his client row — trades don't appear in ARIA Personal. Fix: Joshua needs to sign up in ARIA Personal, or manual link via DB.</w:t>
       </w:r>
       <w:proofErr w:type="spellStart"/>
       <w:r>
         <w:rPr>
           <w:color w:val="1A1A2E"/>
         </w:rPr>
-        <w:t>personal_user_id</w:t>
       </w:r>
       <w:proofErr w:type="spellEnd"/>
       <w:r>
         <w:rPr>
           <w:color w:val="1A1A2E"/>
         </w:rPr>
-        <w:t xml:space="preserve"> not linked on his client row (data fix needed)</w:t>
       </w:r>
     </w:p>
     <w:p>

</xml_diff>

<commit_message>
feat: household family aggregation view (Feature 4)
- Add Household + HouseholdMember models with privacy toggle
- 7 backend endpoints: CRUD, add/remove members, privacy
- HouseholdsListPage + HouseholdPage with pie chart, goals, privacy toggles
- Household badge on ClientList cards + Households nav link
- household_name field on ClientListItem schema
</commit_message>
<xml_diff>
--- a/documentation/ARIA_Technical_Design_Document.docx
+++ b/documentation/ARIA_Technical_Design_Document.docx
@@ -5794,6 +5794,231 @@
         <w:br w:type="page"/>
       </w:r>
     </w:p>
+    <w:p>
+      <w:pPr>
+        <w:pStyle w:val="Heading3"/>
+      </w:pPr>
+      <w:r>
+        <w:t>2.4.1  Core CRM</w:t>
+      </w:r>
+    </w:p>
+    <w:p>
+      <w:r>
+        <w:drawing>
+          <wp:inline xmlns:a="http://schemas.openxmlformats.org/drawingml/2006/main" xmlns:pic="http://schemas.openxmlformats.org/drawingml/2006/picture">
+            <wp:extent cx="5029200" cy="13657039"/>
+            <wp:docPr id="1" name="Picture 1"/>
+            <wp:cNvGraphicFramePr>
+              <a:graphicFrameLocks noChangeAspect="1"/>
+            </wp:cNvGraphicFramePr>
+            <a:graphic>
+              <a:graphicData uri="http://schemas.openxmlformats.org/drawingml/2006/picture">
+                <pic:pic>
+                  <pic:nvPicPr>
+                    <pic:cNvPr id="0" name="mermaid-diagram-2026-04-05-092814.png"/>
+                    <pic:cNvPicPr/>
+                  </pic:nvPicPr>
+                  <pic:blipFill>
+                    <a:blip r:embed="rId11"/>
+                    <a:stretch>
+                      <a:fillRect/>
+                    </a:stretch>
+                  </pic:blipFill>
+                  <pic:spPr>
+                    <a:xfrm>
+                      <a:off x="0" y="0"/>
+                      <a:ext cx="5029200" cy="13657039"/>
+                    </a:xfrm>
+                    <a:prstGeom prst="rect"/>
+                  </pic:spPr>
+                </pic:pic>
+              </a:graphicData>
+            </a:graphic>
+          </wp:inline>
+        </w:drawing>
+      </w:r>
+    </w:p>
+    <w:p/>
+    <w:p>
+      <w:pPr>
+        <w:pStyle w:val="Heading3"/>
+      </w:pPr>
+      <w:r>
+        <w:t>2.4.2  Portfolio &amp; Holdings</w:t>
+      </w:r>
+    </w:p>
+    <w:p>
+      <w:r>
+        <w:drawing>
+          <wp:inline xmlns:a="http://schemas.openxmlformats.org/drawingml/2006/main" xmlns:pic="http://schemas.openxmlformats.org/drawingml/2006/picture">
+            <wp:extent cx="5029200" cy="4368714"/>
+            <wp:docPr id="2" name="Picture 2"/>
+            <wp:cNvGraphicFramePr>
+              <a:graphicFrameLocks noChangeAspect="1"/>
+            </wp:cNvGraphicFramePr>
+            <a:graphic>
+              <a:graphicData uri="http://schemas.openxmlformats.org/drawingml/2006/picture">
+                <pic:pic>
+                  <pic:nvPicPr>
+                    <pic:cNvPr id="0" name="mermaid-diagram-2026-04-05-092910.png"/>
+                    <pic:cNvPicPr/>
+                  </pic:nvPicPr>
+                  <pic:blipFill>
+                    <a:blip r:embed="rId12"/>
+                    <a:stretch>
+                      <a:fillRect/>
+                    </a:stretch>
+                  </pic:blipFill>
+                  <pic:spPr>
+                    <a:xfrm>
+                      <a:off x="0" y="0"/>
+                      <a:ext cx="5029200" cy="4368714"/>
+                    </a:xfrm>
+                    <a:prstGeom prst="rect"/>
+                  </pic:spPr>
+                </pic:pic>
+              </a:graphicData>
+            </a:graphic>
+          </wp:inline>
+        </w:drawing>
+      </w:r>
+    </w:p>
+    <w:p/>
+    <w:p>
+      <w:pPr>
+        <w:pStyle w:val="Heading3"/>
+      </w:pPr>
+      <w:r>
+        <w:t>2.4.3  Trade Workflow</w:t>
+      </w:r>
+    </w:p>
+    <w:p>
+      <w:r>
+        <w:drawing>
+          <wp:inline xmlns:a="http://schemas.openxmlformats.org/drawingml/2006/main" xmlns:pic="http://schemas.openxmlformats.org/drawingml/2006/picture">
+            <wp:extent cx="5029200" cy="11221286"/>
+            <wp:docPr id="3" name="Picture 3"/>
+            <wp:cNvGraphicFramePr>
+              <a:graphicFrameLocks noChangeAspect="1"/>
+            </wp:cNvGraphicFramePr>
+            <a:graphic>
+              <a:graphicData uri="http://schemas.openxmlformats.org/drawingml/2006/picture">
+                <pic:pic>
+                  <pic:nvPicPr>
+                    <pic:cNvPr id="0" name="mermaid-diagram-2026-04-05-092929.png"/>
+                    <pic:cNvPicPr/>
+                  </pic:nvPicPr>
+                  <pic:blipFill>
+                    <a:blip r:embed="rId13"/>
+                    <a:stretch>
+                      <a:fillRect/>
+                    </a:stretch>
+                  </pic:blipFill>
+                  <pic:spPr>
+                    <a:xfrm>
+                      <a:off x="0" y="0"/>
+                      <a:ext cx="5029200" cy="11221286"/>
+                    </a:xfrm>
+                    <a:prstGeom prst="rect"/>
+                  </pic:spPr>
+                </pic:pic>
+              </a:graphicData>
+            </a:graphic>
+          </wp:inline>
+        </w:drawing>
+      </w:r>
+    </w:p>
+    <w:p/>
+    <w:p>
+      <w:pPr>
+        <w:pStyle w:val="Heading3"/>
+      </w:pPr>
+      <w:r>
+        <w:t>2.4.4  Billing</w:t>
+      </w:r>
+    </w:p>
+    <w:p>
+      <w:r>
+        <w:drawing>
+          <wp:inline xmlns:a="http://schemas.openxmlformats.org/drawingml/2006/main" xmlns:pic="http://schemas.openxmlformats.org/drawingml/2006/picture">
+            <wp:extent cx="5029200" cy="3812957"/>
+            <wp:docPr id="4" name="Picture 4"/>
+            <wp:cNvGraphicFramePr>
+              <a:graphicFrameLocks noChangeAspect="1"/>
+            </wp:cNvGraphicFramePr>
+            <a:graphic>
+              <a:graphicData uri="http://schemas.openxmlformats.org/drawingml/2006/picture">
+                <pic:pic>
+                  <pic:nvPicPr>
+                    <pic:cNvPr id="0" name="mermaid-diagram-2026-04-05-092945.png"/>
+                    <pic:cNvPicPr/>
+                  </pic:nvPicPr>
+                  <pic:blipFill>
+                    <a:blip r:embed="rId14"/>
+                    <a:stretch>
+                      <a:fillRect/>
+                    </a:stretch>
+                  </pic:blipFill>
+                  <pic:spPr>
+                    <a:xfrm>
+                      <a:off x="0" y="0"/>
+                      <a:ext cx="5029200" cy="3812957"/>
+                    </a:xfrm>
+                    <a:prstGeom prst="rect"/>
+                  </pic:spPr>
+                </pic:pic>
+              </a:graphicData>
+            </a:graphic>
+          </wp:inline>
+        </w:drawing>
+      </w:r>
+    </w:p>
+    <w:p/>
+    <w:p>
+      <w:pPr>
+        <w:pStyle w:val="Heading3"/>
+      </w:pPr>
+      <w:r>
+        <w:t>2.4.5  Pipeline &amp; Tasks</w:t>
+      </w:r>
+    </w:p>
+    <w:p>
+      <w:r>
+        <w:drawing>
+          <wp:inline xmlns:a="http://schemas.openxmlformats.org/drawingml/2006/main" xmlns:pic="http://schemas.openxmlformats.org/drawingml/2006/picture">
+            <wp:extent cx="5029200" cy="15497932"/>
+            <wp:docPr id="5" name="Picture 5"/>
+            <wp:cNvGraphicFramePr>
+              <a:graphicFrameLocks noChangeAspect="1"/>
+            </wp:cNvGraphicFramePr>
+            <a:graphic>
+              <a:graphicData uri="http://schemas.openxmlformats.org/drawingml/2006/picture">
+                <pic:pic>
+                  <pic:nvPicPr>
+                    <pic:cNvPr id="0" name="mermaid-diagram-2026-04-05-093100.png"/>
+                    <pic:cNvPicPr/>
+                  </pic:nvPicPr>
+                  <pic:blipFill>
+                    <a:blip r:embed="rId15"/>
+                    <a:stretch>
+                      <a:fillRect/>
+                    </a:stretch>
+                  </pic:blipFill>
+                  <pic:spPr>
+                    <a:xfrm>
+                      <a:off x="0" y="0"/>
+                      <a:ext cx="5029200" cy="15497932"/>
+                    </a:xfrm>
+                    <a:prstGeom prst="rect"/>
+                  </pic:spPr>
+                </pic:pic>
+              </a:graphicData>
+            </a:graphic>
+          </wp:inline>
+        </w:drawing>
+      </w:r>
+    </w:p>
+    <w:p/>
     <w:p>
       <w:pPr>
         <w:pStyle w:val="Heading1"/>

</xml_diff>